<commit_message>
pwa(fase 0.9): Lighthouse móvil línea base + informe actualizado
auditorias/lighthouse-movil-20260906.{json,html}: Best Practices 100, Performance 65 (mobile). Audits móviles clave PASS (viewport, font-size 97%, passive listeners, console errors, text compression, dom-size). Pendiente: minificar app.js (FAIL unminified-javascript ~26 KiB) -> Fase 2 con esbuild. El hallazgo 'multiple redirects 4.8s' es artefacto del test (cuenta el 308 http->https).

INFORME-APP-MOVIL.md/.docx: sección de progreso de Fase 0 (0.1-0.8 hechos y desplegados) + resultados Lighthouse + pendientes.

Co-Authored-By: Claude Sonnet 5 <noreply@anthropic.com>

Claude-Session: https://claude.ai/code/session_01H9drUZMVZsLsteod2g4znk
</commit_message>
<xml_diff>
--- a/INFORME-APP-MOVIL.docx
+++ b/INFORME-APP-MOVIL.docx
@@ -9605,20 +9605,1538 @@
     </w:p>
     <w:p>
       <w:pPr>
+        <w:pBdr>
+          <w:bottom w:val="single" w:color="CCCCCC" w:sz="6"/>
+        </w:pBdr>
+        <w:spacing w:after="160" w:before="80"/>
+      </w:pPr>
+    </w:p>
+    <w:p>
+      <w:pPr>
+        <w:spacing w:after="60"/>
+      </w:pPr>
+    </w:p>
+    <w:p>
+      <w:pPr>
+        <w:pStyle w:val="Heading2"/>
+        <w:spacing w:after="100" w:before="240"/>
+      </w:pPr>
+      <w:r>
+        <w:t xml:space="preserve">Progreso de la Fase 0 (2026-09-06)</w:t>
+      </w:r>
+    </w:p>
+    <w:p>
+      <w:pPr>
+        <w:spacing w:after="60"/>
+      </w:pPr>
+    </w:p>
+    <w:p>
+      <w:pPr>
         <w:spacing w:after="120"/>
       </w:pPr>
       <w:r>
-        <w:t xml:space="preserve">_Detalle completo de cada investigación: transcripciones de los 3 agentes (Fable) de esta sesión. Siguiente acción: </w:t>
-      </w:r>
+        <w:t xml:space="preserve">Hecho y desplegado en </w:t>
+      </w:r>
+      <w:r>
+        <w:rPr>
+          <w:rFonts w:ascii="Consolas" w:cs="Consolas" w:eastAsia="Consolas" w:hAnsi="Consolas"/>
+          <w:sz w:val="19"/>
+          <w:szCs w:val="19"/>
+        </w:rPr>
+        <w:t xml:space="preserve">https://kunturmasha.vercel.app</w:t>
+      </w:r>
+      <w:r>
+        <w:t xml:space="preserve"> (verificado en vivo):</w:t>
+      </w:r>
+    </w:p>
+    <w:p>
+      <w:pPr>
+        <w:spacing w:after="60"/>
+      </w:pPr>
+    </w:p>
+    <w:p>
+      <w:pPr>
+        <w:pStyle w:val="ListParagraph"/>
+        <w:numPr>
+          <w:ilvl w:val="0"/>
+          <w:numId w:val="1"/>
+        </w:numPr>
+        <w:spacing w:after="40"/>
+      </w:pPr>
       <w:r>
         <w:rPr>
           <w:b/>
           <w:bCs/>
         </w:rPr>
-        <w:t xml:space="preserve">Fase 0, paso 0.1 — generar el set de iconos PNG + manifest completo.</w:t>
-      </w:r>
-      <w:r>
-        <w:t xml:space="preserve">_</w:t>
+        <w:t xml:space="preserve">0.1</w:t>
+      </w:r>
+      <w:r>
+        <w:t xml:space="preserve"> iconos PNG (192/512 + maskable 192/512 + apple-touch 180 + 3 shortcuts) +</w:t>
+      </w:r>
+    </w:p>
+    <w:p>
+      <w:pPr>
+        <w:spacing w:after="120"/>
+      </w:pPr>
+      <w:r>
+        <w:t xml:space="preserve">  manifest completo (</w:t>
+      </w:r>
+      <w:r>
+        <w:rPr>
+          <w:rFonts w:ascii="Consolas" w:cs="Consolas" w:eastAsia="Consolas" w:hAnsi="Consolas"/>
+          <w:sz w:val="19"/>
+          <w:szCs w:val="19"/>
+        </w:rPr>
+        <w:t xml:space="preserve">id</w:t>
+      </w:r>
+      <w:r>
+        <w:t xml:space="preserve">, </w:t>
+      </w:r>
+      <w:r>
+        <w:rPr>
+          <w:rFonts w:ascii="Consolas" w:cs="Consolas" w:eastAsia="Consolas" w:hAnsi="Consolas"/>
+          <w:sz w:val="19"/>
+          <w:szCs w:val="19"/>
+        </w:rPr>
+        <w:t xml:space="preserve">screenshots</w:t>
+      </w:r>
+      <w:r>
+        <w:t xml:space="preserve">, </w:t>
+      </w:r>
+      <w:r>
+        <w:rPr>
+          <w:rFonts w:ascii="Consolas" w:cs="Consolas" w:eastAsia="Consolas" w:hAnsi="Consolas"/>
+          <w:sz w:val="19"/>
+          <w:szCs w:val="19"/>
+        </w:rPr>
+        <w:t xml:space="preserve">launch_handler</w:t>
+      </w:r>
+      <w:r>
+        <w:t xml:space="preserve">, </w:t>
+      </w:r>
+      <w:r>
+        <w:rPr>
+          <w:rFonts w:ascii="Consolas" w:cs="Consolas" w:eastAsia="Consolas" w:hAnsi="Consolas"/>
+          <w:sz w:val="19"/>
+          <w:szCs w:val="19"/>
+        </w:rPr>
+        <w:t xml:space="preserve">display_override</w:t>
+      </w:r>
+      <w:r>
+        <w:t xml:space="preserve">,   </w:t>
+      </w:r>
+      <w:r>
+        <w:rPr>
+          <w:rFonts w:ascii="Consolas" w:cs="Consolas" w:eastAsia="Consolas" w:hAnsi="Consolas"/>
+          <w:sz w:val="19"/>
+          <w:szCs w:val="19"/>
+        </w:rPr>
+        <w:t xml:space="preserve">handle_links</w:t>
+      </w:r>
+      <w:r>
+        <w:t xml:space="preserve">, iconos de shortcuts). Elimina el bug de instalabilidad del SVG   con </w:t>
+      </w:r>
+      <w:r>
+        <w:rPr>
+          <w:rFonts w:ascii="Consolas" w:cs="Consolas" w:eastAsia="Consolas" w:hAnsi="Consolas"/>
+          <w:sz w:val="19"/>
+          <w:szCs w:val="19"/>
+        </w:rPr>
+        <w:t xml:space="preserve">sizes:"any"</w:t>
+      </w:r>
+      <w:r>
+        <w:t xml:space="preserve">. </w:t>
+      </w:r>
+      <w:r>
+        <w:rPr>
+          <w:rFonts w:ascii="Consolas" w:cs="Consolas" w:eastAsia="Consolas" w:hAnsi="Consolas"/>
+          <w:sz w:val="19"/>
+          <w:szCs w:val="19"/>
+        </w:rPr>
+        <w:t xml:space="preserve">apple-touch-icon</w:t>
+      </w:r>
+      <w:r>
+        <w:t xml:space="preserve"> PNG + </w:t>
+      </w:r>
+      <w:r>
+        <w:rPr>
+          <w:rFonts w:ascii="Consolas" w:cs="Consolas" w:eastAsia="Consolas" w:hAnsi="Consolas"/>
+          <w:sz w:val="19"/>
+          <w:szCs w:val="19"/>
+        </w:rPr>
+        <w:t xml:space="preserve">mobile-web-app-capable</w:t>
+      </w:r>
+      <w:r>
+        <w:t xml:space="preserve">.</w:t>
+      </w:r>
+    </w:p>
+    <w:p>
+      <w:pPr>
+        <w:pStyle w:val="ListParagraph"/>
+        <w:numPr>
+          <w:ilvl w:val="0"/>
+          <w:numId w:val="1"/>
+        </w:numPr>
+        <w:spacing w:after="40"/>
+      </w:pPr>
+      <w:r>
+        <w:rPr>
+          <w:b/>
+          <w:bCs/>
+        </w:rPr>
+        <w:t xml:space="preserve">0.3</w:t>
+      </w:r>
+      <w:r>
+        <w:t xml:space="preserve"> </w:t>
+      </w:r>
+      <w:r>
+        <w:rPr>
+          <w:rFonts w:ascii="Consolas" w:cs="Consolas" w:eastAsia="Consolas" w:hAnsi="Consolas"/>
+          <w:sz w:val="19"/>
+          <w:szCs w:val="19"/>
+        </w:rPr>
+        <w:t xml:space="preserve">sw.js</w:t>
+      </w:r>
+      <w:r>
+        <w:t xml:space="preserve"> v6: sin </w:t>
+      </w:r>
+      <w:r>
+        <w:rPr>
+          <w:rFonts w:ascii="Consolas" w:cs="Consolas" w:eastAsia="Consolas" w:hAnsi="Consolas"/>
+          <w:sz w:val="19"/>
+          <w:szCs w:val="19"/>
+        </w:rPr>
+        <w:t xml:space="preserve">skipWaiting()</w:t>
+      </w:r>
+      <w:r>
+        <w:t xml:space="preserve"> automático (el aviso "nueva versión" de</w:t>
+      </w:r>
+    </w:p>
+    <w:p>
+      <w:pPr>
+        <w:spacing w:after="120"/>
+      </w:pPr>
+      <w:r>
+        <w:t xml:space="preserve">  </w:t>
+      </w:r>
+      <w:r>
+        <w:rPr>
+          <w:rFonts w:ascii="Consolas" w:cs="Consolas" w:eastAsia="Consolas" w:hAnsi="Consolas"/>
+          <w:sz w:val="19"/>
+          <w:szCs w:val="19"/>
+        </w:rPr>
+        <w:t xml:space="preserve">pwa.js</w:t>
+      </w:r>
+      <w:r>
+        <w:t xml:space="preserve"> lo dispara), </w:t>
+      </w:r>
+      <w:r>
+        <w:rPr>
+          <w:rFonts w:ascii="Consolas" w:cs="Consolas" w:eastAsia="Consolas" w:hAnsi="Consolas"/>
+          <w:sz w:val="19"/>
+          <w:szCs w:val="19"/>
+        </w:rPr>
+        <w:t xml:space="preserve">navigationPreload</w:t>
+      </w:r>
+      <w:r>
+        <w:t xml:space="preserve">, </w:t>
+      </w:r>
+      <w:r>
+        <w:rPr>
+          <w:rFonts w:ascii="Consolas" w:cs="Consolas" w:eastAsia="Consolas" w:hAnsi="Consolas"/>
+          <w:sz w:val="19"/>
+          <w:szCs w:val="19"/>
+        </w:rPr>
+        <w:t xml:space="preserve">offline.html</w:t>
+      </w:r>
+      <w:r>
+        <w:t xml:space="preserve"> (devuelve 200 → un TWA   no crashea) como último recurso, poda LRU. </w:t>
+      </w:r>
+      <w:r>
+        <w:rPr>
+          <w:rFonts w:ascii="Consolas" w:cs="Consolas" w:eastAsia="Consolas" w:hAnsi="Consolas"/>
+          <w:sz w:val="19"/>
+          <w:szCs w:val="19"/>
+        </w:rPr>
+        <w:t xml:space="preserve">pwa.js</w:t>
+      </w:r>
+      <w:r>
+        <w:t xml:space="preserve">: </w:t>
+      </w:r>
+      <w:r>
+        <w:rPr>
+          <w:rFonts w:ascii="Consolas" w:cs="Consolas" w:eastAsia="Consolas" w:hAnsi="Consolas"/>
+          <w:sz w:val="19"/>
+          <w:szCs w:val="19"/>
+        </w:rPr>
+        <w:t xml:space="preserve">navigator.storage.persist()</w:t>
+      </w:r>
+      <w:r>
+        <w:t xml:space="preserve">   + </w:t>
+      </w:r>
+      <w:r>
+        <w:rPr>
+          <w:rFonts w:ascii="Consolas" w:cs="Consolas" w:eastAsia="Consolas" w:hAnsi="Consolas"/>
+          <w:sz w:val="19"/>
+          <w:szCs w:val="19"/>
+        </w:rPr>
+        <w:t xml:space="preserve">updateViaCache:'none'</w:t>
+      </w:r>
+      <w:r>
+        <w:t xml:space="preserve">.</w:t>
+      </w:r>
+    </w:p>
+    <w:p>
+      <w:pPr>
+        <w:pStyle w:val="ListParagraph"/>
+        <w:numPr>
+          <w:ilvl w:val="0"/>
+          <w:numId w:val="1"/>
+        </w:numPr>
+        <w:spacing w:after="40"/>
+      </w:pPr>
+      <w:r>
+        <w:rPr>
+          <w:b/>
+          <w:bCs/>
+        </w:rPr>
+        <w:t xml:space="preserve">0.4</w:t>
+      </w:r>
+      <w:r>
+        <w:t xml:space="preserve"> CSS móvil (aditivo, solo táctil): </w:t>
+      </w:r>
+      <w:r>
+        <w:rPr>
+          <w:rFonts w:ascii="Consolas" w:cs="Consolas" w:eastAsia="Consolas" w:hAnsi="Consolas"/>
+          <w:sz w:val="19"/>
+          <w:szCs w:val="19"/>
+        </w:rPr>
+        <w:t xml:space="preserve">env(safe-area-inset-*)</w:t>
+      </w:r>
+      <w:r>
+        <w:t xml:space="preserve"> en </w:t>
+      </w:r>
+      <w:r>
+        <w:rPr>
+          <w:rFonts w:ascii="Consolas" w:cs="Consolas" w:eastAsia="Consolas" w:hAnsi="Consolas"/>
+          <w:sz w:val="19"/>
+          <w:szCs w:val="19"/>
+        </w:rPr>
+        <w:t xml:space="preserve">body</w:t>
+      </w:r>
+      <w:r>
+        <w:t xml:space="preserve"> y</w:t>
+      </w:r>
+    </w:p>
+    <w:p>
+      <w:pPr>
+        <w:spacing w:after="120"/>
+      </w:pPr>
+      <w:r>
+        <w:t xml:space="preserve">  </w:t>
+      </w:r>
+      <w:r>
+        <w:rPr>
+          <w:rFonts w:ascii="Consolas" w:cs="Consolas" w:eastAsia="Consolas" w:hAnsi="Consolas"/>
+          <w:sz w:val="19"/>
+          <w:szCs w:val="19"/>
+        </w:rPr>
+        <w:t xml:space="preserve">.view-tabs</w:t>
+      </w:r>
+      <w:r>
+        <w:t xml:space="preserve"> sticky; </w:t>
+      </w:r>
+      <w:r>
+        <w:rPr>
+          <w:b/>
+          <w:bCs/>
+        </w:rPr>
+        <w:t xml:space="preserve">inputs a 16px</w:t>
+      </w:r>
+      <w:r>
+        <w:t xml:space="preserve"> bajo </w:t>
+      </w:r>
+      <w:r>
+        <w:rPr>
+          <w:rFonts w:ascii="Consolas" w:cs="Consolas" w:eastAsia="Consolas" w:hAnsi="Consolas"/>
+          <w:sz w:val="19"/>
+          <w:szCs w:val="19"/>
+        </w:rPr>
+        <w:t xml:space="preserve">pointer:coarse</w:t>
+      </w:r>
+      <w:r>
+        <w:t xml:space="preserve"> (mata el zoom de   iOS); </w:t>
+      </w:r>
+      <w:r>
+        <w:rPr>
+          <w:rFonts w:ascii="Consolas" w:cs="Consolas" w:eastAsia="Consolas" w:hAnsi="Consolas"/>
+          <w:sz w:val="19"/>
+          <w:szCs w:val="19"/>
+        </w:rPr>
+        <w:t xml:space="preserve">min-height:100svh</w:t>
+      </w:r>
+      <w:r>
+        <w:t xml:space="preserve">; objetivos táctiles a </w:t>
+      </w:r>
+      <w:r>
+        <w:rPr>
+          <w:b/>
+          <w:bCs/>
+        </w:rPr>
+        <w:t xml:space="preserve">48px</w:t>
+      </w:r>
+      <w:r>
+        <w:t xml:space="preserve"> (incluye </w:t>
+      </w:r>
+      <w:r>
+        <w:rPr>
+          <w:rFonts w:ascii="Consolas" w:cs="Consolas" w:eastAsia="Consolas" w:hAnsi="Consolas"/>
+          <w:sz w:val="19"/>
+          <w:szCs w:val="19"/>
+        </w:rPr>
+        <w:t xml:space="preserve">select</w:t>
+      </w:r>
+      <w:r>
+        <w:t xml:space="preserve">,   </w:t>
+      </w:r>
+      <w:r>
+        <w:rPr>
+          <w:rFonts w:ascii="Consolas" w:cs="Consolas" w:eastAsia="Consolas" w:hAnsi="Consolas"/>
+          <w:sz w:val="19"/>
+          <w:szCs w:val="19"/>
+        </w:rPr>
+        <w:t xml:space="preserve">input[type=date]</w:t>
+      </w:r>
+      <w:r>
+        <w:t xml:space="preserve">, </w:t>
+      </w:r>
+      <w:r>
+        <w:rPr>
+          <w:rFonts w:ascii="Consolas" w:cs="Consolas" w:eastAsia="Consolas" w:hAnsi="Consolas"/>
+          <w:sz w:val="19"/>
+          <w:szCs w:val="19"/>
+        </w:rPr>
+        <w:t xml:space="preserve">empresa-switch</w:t>
+      </w:r>
+      <w:r>
+        <w:t xml:space="preserve">, acciones de fila); </w:t>
+      </w:r>
+      <w:r>
+        <w:rPr>
+          <w:rFonts w:ascii="Consolas" w:cs="Consolas" w:eastAsia="Consolas" w:hAnsi="Consolas"/>
+          <w:sz w:val="19"/>
+          <w:szCs w:val="19"/>
+        </w:rPr>
+        <w:t xml:space="preserve">overscroll-behavior-y:none</w:t>
+      </w:r>
+      <w:r>
+        <w:t xml:space="preserve">   (mata el pull-to-refresh) + </w:t>
+      </w:r>
+      <w:r>
+        <w:rPr>
+          <w:rFonts w:ascii="Consolas" w:cs="Consolas" w:eastAsia="Consolas" w:hAnsi="Consolas"/>
+          <w:sz w:val="19"/>
+          <w:szCs w:val="19"/>
+        </w:rPr>
+        <w:t xml:space="preserve">contain</w:t>
+      </w:r>
+      <w:r>
+        <w:t xml:space="preserve"> en scrollables; </w:t>
+      </w:r>
+      <w:r>
+        <w:rPr>
+          <w:rFonts w:ascii="Consolas" w:cs="Consolas" w:eastAsia="Consolas" w:hAnsi="Consolas"/>
+          <w:sz w:val="19"/>
+          <w:szCs w:val="19"/>
+        </w:rPr>
+        <w:t xml:space="preserve">@media (hover:none)</w:t>
+      </w:r>
+      <w:r>
+        <w:t xml:space="preserve">   neutraliza los </w:t>
+      </w:r>
+      <w:r>
+        <w:rPr>
+          <w:rFonts w:ascii="Consolas" w:cs="Consolas" w:eastAsia="Consolas" w:hAnsi="Consolas"/>
+          <w:sz w:val="19"/>
+          <w:szCs w:val="19"/>
+        </w:rPr>
+        <w:t xml:space="preserve">:hover</w:t>
+      </w:r>
+      <w:r>
+        <w:t xml:space="preserve"> con transform pegados; </w:t>
+      </w:r>
+      <w:r>
+        <w:rPr>
+          <w:rFonts w:ascii="Consolas" w:cs="Consolas" w:eastAsia="Consolas" w:hAnsi="Consolas"/>
+          <w:sz w:val="19"/>
+          <w:szCs w:val="19"/>
+        </w:rPr>
+        <w:t xml:space="preserve">user-select:none</w:t>
+      </w:r>
+      <w:r>
+        <w:t xml:space="preserve"> en controles.</w:t>
+      </w:r>
+    </w:p>
+    <w:p>
+      <w:pPr>
+        <w:pStyle w:val="ListParagraph"/>
+        <w:numPr>
+          <w:ilvl w:val="0"/>
+          <w:numId w:val="1"/>
+        </w:numPr>
+        <w:spacing w:after="40"/>
+      </w:pPr>
+      <w:r>
+        <w:rPr>
+          <w:b/>
+          <w:bCs/>
+        </w:rPr>
+        <w:t xml:space="preserve">0.5</w:t>
+      </w:r>
+      <w:r>
+        <w:t xml:space="preserve"> </w:t>
+      </w:r>
+      <w:r>
+        <w:rPr>
+          <w:rFonts w:ascii="Consolas" w:cs="Consolas" w:eastAsia="Consolas" w:hAnsi="Consolas"/>
+          <w:sz w:val="19"/>
+          <w:szCs w:val="19"/>
+        </w:rPr>
+        <w:t xml:space="preserve">inputmode</w:t>
+      </w:r>
+      <w:r>
+        <w:t xml:space="preserve">/</w:t>
+      </w:r>
+      <w:r>
+        <w:rPr>
+          <w:rFonts w:ascii="Consolas" w:cs="Consolas" w:eastAsia="Consolas" w:hAnsi="Consolas"/>
+          <w:sz w:val="19"/>
+          <w:szCs w:val="19"/>
+        </w:rPr>
+        <w:t xml:space="preserve">enterkeyhint</w:t>
+      </w:r>
+      <w:r>
+        <w:t xml:space="preserve">/</w:t>
+      </w:r>
+      <w:r>
+        <w:rPr>
+          <w:rFonts w:ascii="Consolas" w:cs="Consolas" w:eastAsia="Consolas" w:hAnsi="Consolas"/>
+          <w:sz w:val="19"/>
+          <w:szCs w:val="19"/>
+        </w:rPr>
+        <w:t xml:space="preserve">autocomplete</w:t>
+      </w:r>
+      <w:r>
+        <w:t xml:space="preserve"> en </w:t>
+      </w:r>
+      <w:r>
+        <w:rPr>
+          <w:rFonts w:ascii="Consolas" w:cs="Consolas" w:eastAsia="Consolas" w:hAnsi="Consolas"/>
+          <w:sz w:val="19"/>
+          <w:szCs w:val="19"/>
+        </w:rPr>
+        <w:t xml:space="preserve">telefono</w:t>
+      </w:r>
+      <w:r>
+        <w:t xml:space="preserve">, </w:t>
+      </w:r>
+      <w:r>
+        <w:rPr>
+          <w:rFonts w:ascii="Consolas" w:cs="Consolas" w:eastAsia="Consolas" w:hAnsi="Consolas"/>
+          <w:sz w:val="19"/>
+          <w:szCs w:val="19"/>
+        </w:rPr>
+        <w:t xml:space="preserve">precio</w:t>
+      </w:r>
+      <w:r>
+        <w:t xml:space="preserve">,</w:t>
+      </w:r>
+    </w:p>
+    <w:p>
+      <w:pPr>
+        <w:spacing w:after="120"/>
+      </w:pPr>
+      <w:r>
+        <w:t xml:space="preserve">  </w:t>
+      </w:r>
+      <w:r>
+        <w:rPr>
+          <w:rFonts w:ascii="Consolas" w:cs="Consolas" w:eastAsia="Consolas" w:hAnsi="Consolas"/>
+          <w:sz w:val="19"/>
+          <w:szCs w:val="19"/>
+        </w:rPr>
+        <w:t xml:space="preserve">volumenM3</w:t>
+      </w:r>
+      <w:r>
+        <w:t xml:space="preserve">, </w:t>
+      </w:r>
+      <w:r>
+        <w:rPr>
+          <w:rFonts w:ascii="Consolas" w:cs="Consolas" w:eastAsia="Consolas" w:hAnsi="Consolas"/>
+          <w:sz w:val="19"/>
+          <w:szCs w:val="19"/>
+        </w:rPr>
+        <w:t xml:space="preserve">gastoMonto</w:t>
+      </w:r>
+      <w:r>
+        <w:t xml:space="preserve">, </w:t>
+      </w:r>
+      <w:r>
+        <w:rPr>
+          <w:rFonts w:ascii="Consolas" w:cs="Consolas" w:eastAsia="Consolas" w:hAnsi="Consolas"/>
+          <w:sz w:val="19"/>
+          <w:szCs w:val="19"/>
+        </w:rPr>
+        <w:t xml:space="preserve">fleteVolumen</w:t>
+      </w:r>
+      <w:r>
+        <w:t xml:space="preserve">, </w:t>
+      </w:r>
+      <w:r>
+        <w:rPr>
+          <w:rFonts w:ascii="Consolas" w:cs="Consolas" w:eastAsia="Consolas" w:hAnsi="Consolas"/>
+          <w:sz w:val="19"/>
+          <w:szCs w:val="19"/>
+        </w:rPr>
+        <w:t xml:space="preserve">detalleUbicacion</w:t>
+      </w:r>
+      <w:r>
+        <w:t xml:space="preserve"> y los del Hub.</w:t>
+      </w:r>
+    </w:p>
+    <w:p>
+      <w:pPr>
+        <w:pStyle w:val="ListParagraph"/>
+        <w:numPr>
+          <w:ilvl w:val="0"/>
+          <w:numId w:val="1"/>
+        </w:numPr>
+        <w:spacing w:after="40"/>
+      </w:pPr>
+      <w:r>
+        <w:rPr>
+          <w:b/>
+          <w:bCs/>
+        </w:rPr>
+        <w:t xml:space="preserve">0.6</w:t>
+      </w:r>
+      <w:r>
+        <w:t xml:space="preserve"> (parte segura) modo ligero: </w:t>
+      </w:r>
+      <w:r>
+        <w:rPr>
+          <w:rFonts w:ascii="Consolas" w:cs="Consolas" w:eastAsia="Consolas" w:hAnsi="Consolas"/>
+          <w:sz w:val="19"/>
+          <w:szCs w:val="19"/>
+        </w:rPr>
+        <w:t xml:space="preserve">html.fx-lite</w:t>
+      </w:r>
+      <w:r>
+        <w:t xml:space="preserve"> automático si</w:t>
+      </w:r>
+    </w:p>
+    <w:p>
+      <w:pPr>
+        <w:spacing w:after="120"/>
+      </w:pPr>
+      <w:r>
+        <w:t xml:space="preserve">  </w:t>
+      </w:r>
+      <w:r>
+        <w:rPr>
+          <w:rFonts w:ascii="Consolas" w:cs="Consolas" w:eastAsia="Consolas" w:hAnsi="Consolas"/>
+          <w:sz w:val="19"/>
+          <w:szCs w:val="19"/>
+        </w:rPr>
+        <w:t xml:space="preserve">deviceMemory&lt;=4</w:t>
+      </w:r>
+      <w:r>
+        <w:t xml:space="preserve">/</w:t>
+      </w:r>
+      <w:r>
+        <w:rPr>
+          <w:rFonts w:ascii="Consolas" w:cs="Consolas" w:eastAsia="Consolas" w:hAnsi="Consolas"/>
+          <w:sz w:val="19"/>
+          <w:szCs w:val="19"/>
+        </w:rPr>
+        <w:t xml:space="preserve">hardwareConcurrency&lt;=4</w:t>
+      </w:r>
+      <w:r>
+        <w:t xml:space="preserve"> (o </w:t>
+      </w:r>
+      <w:r>
+        <w:rPr>
+          <w:rFonts w:ascii="Consolas" w:cs="Consolas" w:eastAsia="Consolas" w:hAnsi="Consolas"/>
+          <w:sz w:val="19"/>
+          <w:szCs w:val="19"/>
+        </w:rPr>
+        <w:t xml:space="preserve">localStorage.wcs_modo_ligero=1</w:t>
+      </w:r>
+      <w:r>
+        <w:t xml:space="preserve">;   API </w:t>
+      </w:r>
+      <w:r>
+        <w:rPr>
+          <w:rFonts w:ascii="Consolas" w:cs="Consolas" w:eastAsia="Consolas" w:hAnsi="Consolas"/>
+          <w:sz w:val="19"/>
+          <w:szCs w:val="19"/>
+        </w:rPr>
+        <w:t xml:space="preserve">window.wcsModoLigero(on)</w:t>
+      </w:r>
+      <w:r>
+        <w:t xml:space="preserve"> para un toggle en Ajustes) → apaga aurora, giro   90s, </w:t>
+      </w:r>
+      <w:r>
+        <w:rPr>
+          <w:rFonts w:ascii="Consolas" w:cs="Consolas" w:eastAsia="Consolas" w:hAnsi="Consolas"/>
+          <w:sz w:val="19"/>
+          <w:szCs w:val="19"/>
+        </w:rPr>
+        <w:t xml:space="preserve">breathe</w:t>
+      </w:r>
+      <w:r>
+        <w:t xml:space="preserve"> y </w:t>
+      </w:r>
+      <w:r>
+        <w:rPr>
+          <w:rFonts w:ascii="Consolas" w:cs="Consolas" w:eastAsia="Consolas" w:hAnsi="Consolas"/>
+          <w:sz w:val="19"/>
+          <w:szCs w:val="19"/>
+        </w:rPr>
+        <w:t xml:space="preserve">backdrop-filter</w:t>
+      </w:r>
+      <w:r>
+        <w:t xml:space="preserve">. </w:t>
+      </w:r>
+      <w:r>
+        <w:rPr>
+          <w:rFonts w:ascii="Consolas" w:cs="Consolas" w:eastAsia="Consolas" w:hAnsi="Consolas"/>
+          <w:sz w:val="19"/>
+          <w:szCs w:val="19"/>
+        </w:rPr>
+        <w:t xml:space="preserve">html.fx-paused</w:t>
+      </w:r>
+      <w:r>
+        <w:t xml:space="preserve"> con </w:t>
+      </w:r>
+      <w:r>
+        <w:rPr>
+          <w:rFonts w:ascii="Consolas" w:cs="Consolas" w:eastAsia="Consolas" w:hAnsi="Consolas"/>
+          <w:sz w:val="19"/>
+          <w:szCs w:val="19"/>
+        </w:rPr>
+        <w:t xml:space="preserve">visibilitychange</w:t>
+      </w:r>
+      <w:r>
+        <w:t xml:space="preserve"> →   congela toda animación cuando la pestaña no se ve. </w:t>
+      </w:r>
+      <w:r>
+        <w:rPr>
+          <w:rFonts w:ascii="Consolas" w:cs="Consolas" w:eastAsia="Consolas" w:hAnsi="Consolas"/>
+          <w:sz w:val="19"/>
+          <w:szCs w:val="19"/>
+        </w:rPr>
+        <w:t xml:space="preserve">content-visibility:auto</w:t>
+      </w:r>
+      <w:r>
+        <w:t xml:space="preserve"> en   las tarjetas de agenda fuera de pantalla (móvil), salvo la editada y las 6   primeras. Verificado: los </w:t>
+      </w:r>
+      <w:r>
+        <w:rPr>
+          <w:rFonts w:ascii="Consolas" w:cs="Consolas" w:eastAsia="Consolas" w:hAnsi="Consolas"/>
+          <w:sz w:val="19"/>
+          <w:szCs w:val="19"/>
+        </w:rPr>
+        <w:t xml:space="preserve">pointermove</w:t>
+      </w:r>
+      <w:r>
+        <w:t xml:space="preserve"> de magnetic/tilt no se registran en   táctil (early-return por </w:t>
+      </w:r>
+      <w:r>
+        <w:rPr>
+          <w:rFonts w:ascii="Consolas" w:cs="Consolas" w:eastAsia="Consolas" w:hAnsi="Consolas"/>
+          <w:sz w:val="19"/>
+          <w:szCs w:val="19"/>
+        </w:rPr>
+        <w:t xml:space="preserve">pointer:coarse</w:t>
+      </w:r>
+      <w:r>
+        <w:t xml:space="preserve">).</w:t>
+      </w:r>
+    </w:p>
+    <w:p>
+      <w:pPr>
+        <w:pStyle w:val="ListParagraph"/>
+        <w:numPr>
+          <w:ilvl w:val="0"/>
+          <w:numId w:val="1"/>
+        </w:numPr>
+        <w:spacing w:after="40"/>
+      </w:pPr>
+      <w:r>
+        <w:rPr>
+          <w:b/>
+          <w:bCs/>
+        </w:rPr>
+        <w:t xml:space="preserve">0.7</w:t>
+      </w:r>
+      <w:r>
+        <w:t xml:space="preserve"> botón "atrás" de Android: </w:t>
+      </w:r>
+      <w:r>
+        <w:rPr>
+          <w:rFonts w:ascii="Consolas" w:cs="Consolas" w:eastAsia="Consolas" w:hAnsi="Consolas"/>
+          <w:sz w:val="19"/>
+          <w:szCs w:val="19"/>
+        </w:rPr>
+        <w:t xml:space="preserve">history.pushState</w:t>
+      </w:r>
+      <w:r>
+        <w:t xml:space="preserve"> por vista + </w:t>
+      </w:r>
+      <w:r>
+        <w:rPr>
+          <w:rFonts w:ascii="Consolas" w:cs="Consolas" w:eastAsia="Consolas" w:hAnsi="Consolas"/>
+          <w:sz w:val="19"/>
+          <w:szCs w:val="19"/>
+        </w:rPr>
+        <w:t xml:space="preserve">popstate</w:t>
+      </w:r>
+    </w:p>
+    <w:p>
+      <w:pPr>
+        <w:spacing w:after="120"/>
+      </w:pPr>
+      <w:r>
+        <w:t xml:space="preserve">  (1º cierra modal abierto, si no vuelve a la vista anterior; nunca sale de golpe).   Base para el </w:t>
+      </w:r>
+      <w:r>
+        <w:rPr>
+          <w:rFonts w:ascii="Consolas" w:cs="Consolas" w:eastAsia="Consolas" w:hAnsi="Consolas"/>
+          <w:sz w:val="19"/>
+          <w:szCs w:val="19"/>
+        </w:rPr>
+        <w:t xml:space="preserve">App.backButton</w:t>
+      </w:r>
+      <w:r>
+        <w:t xml:space="preserve"> de Capacitor. Verificado.</w:t>
+      </w:r>
+    </w:p>
+    <w:p>
+      <w:pPr>
+        <w:pStyle w:val="ListParagraph"/>
+        <w:numPr>
+          <w:ilvl w:val="0"/>
+          <w:numId w:val="1"/>
+        </w:numPr>
+        <w:spacing w:after="40"/>
+      </w:pPr>
+      <w:r>
+        <w:rPr>
+          <w:b/>
+          <w:bCs/>
+        </w:rPr>
+        <w:t xml:space="preserve">0.8</w:t>
+      </w:r>
+      <w:r>
+        <w:t xml:space="preserve"> fuentes </w:t>
+      </w:r>
+      <w:r>
+        <w:rPr>
+          <w:b/>
+          <w:bCs/>
+        </w:rPr>
+        <w:t xml:space="preserve">auto-hospedadas</w:t>
+      </w:r>
+      <w:r>
+        <w:t xml:space="preserve"> (Inter 400–800 + IBM Plex Mono 500–700,</w:t>
+      </w:r>
+    </w:p>
+    <w:p>
+      <w:pPr>
+        <w:spacing w:after="120"/>
+      </w:pPr>
+      <w:r>
+        <w:t xml:space="preserve">  subset latin) en </w:t>
+      </w:r>
+      <w:r>
+        <w:rPr>
+          <w:rFonts w:ascii="Consolas" w:cs="Consolas" w:eastAsia="Consolas" w:hAnsi="Consolas"/>
+          <w:sz w:val="19"/>
+          <w:szCs w:val="19"/>
+        </w:rPr>
+        <w:t xml:space="preserve">/vendor/fonts/</w:t>
+      </w:r>
+      <w:r>
+        <w:t xml:space="preserve">. Fuera Google Fonts y sus entradas de CSP   (</w:t>
+      </w:r>
+      <w:r>
+        <w:rPr>
+          <w:rFonts w:ascii="Consolas" w:cs="Consolas" w:eastAsia="Consolas" w:hAnsi="Consolas"/>
+          <w:sz w:val="19"/>
+          <w:szCs w:val="19"/>
+        </w:rPr>
+        <w:t xml:space="preserve">style-src</w:t>
+      </w:r>
+      <w:r>
+        <w:t xml:space="preserve">/</w:t>
+      </w:r>
+      <w:r>
+        <w:rPr>
+          <w:rFonts w:ascii="Consolas" w:cs="Consolas" w:eastAsia="Consolas" w:hAnsi="Consolas"/>
+          <w:sz w:val="19"/>
+          <w:szCs w:val="19"/>
+        </w:rPr>
+        <w:t xml:space="preserve">font-src</w:t>
+      </w:r>
+      <w:r>
+        <w:t xml:space="preserve">). </w:t>
+      </w:r>
+      <w:r>
+        <w:rPr>
+          <w:rFonts w:ascii="Consolas" w:cs="Consolas" w:eastAsia="Consolas" w:hAnsi="Consolas"/>
+          <w:sz w:val="19"/>
+          <w:szCs w:val="19"/>
+        </w:rPr>
+        <w:t xml:space="preserve">preload</w:t>
+      </w:r>
+      <w:r>
+        <w:t xml:space="preserve"> de </w:t>
+      </w:r>
+      <w:r>
+        <w:rPr>
+          <w:rFonts w:ascii="Consolas" w:cs="Consolas" w:eastAsia="Consolas" w:hAnsi="Consolas"/>
+          <w:sz w:val="19"/>
+          <w:szCs w:val="19"/>
+        </w:rPr>
+        <w:t xml:space="preserve">inter-400/700</w:t>
+      </w:r>
+      <w:r>
+        <w:t xml:space="preserve">. Al precache del SW.</w:t>
+      </w:r>
+    </w:p>
+    <w:p>
+      <w:pPr>
+        <w:pStyle w:val="ListParagraph"/>
+        <w:numPr>
+          <w:ilvl w:val="0"/>
+          <w:numId w:val="1"/>
+        </w:numPr>
+        <w:spacing w:after="40"/>
+      </w:pPr>
+      <w:r>
+        <w:rPr>
+          <w:b/>
+          <w:bCs/>
+        </w:rPr>
+        <w:t xml:space="preserve">Fix</w:t>
+      </w:r>
+      <w:r>
+        <w:t xml:space="preserve"> </w:t>
+      </w:r>
+      <w:r>
+        <w:rPr>
+          <w:rFonts w:ascii="Consolas" w:cs="Consolas" w:eastAsia="Consolas" w:hAnsi="Consolas"/>
+          <w:sz w:val="19"/>
+          <w:szCs w:val="19"/>
+        </w:rPr>
+        <w:t xml:space="preserve">Permissions-Policy</w:t>
+      </w:r>
+      <w:r>
+        <w:t xml:space="preserve"> estaba en </w:t>
+      </w:r>
+      <w:r>
+        <w:rPr>
+          <w:rFonts w:ascii="Consolas" w:cs="Consolas" w:eastAsia="Consolas" w:hAnsi="Consolas"/>
+          <w:sz w:val="19"/>
+          <w:szCs w:val="19"/>
+        </w:rPr>
+        <w:t xml:space="preserve">geolocation=()</w:t>
+      </w:r>
+      <w:r>
+        <w:t xml:space="preserve"> (bloqueaba "usar mi</w:t>
+      </w:r>
+    </w:p>
+    <w:p>
+      <w:pPr>
+        <w:spacing w:after="120"/>
+      </w:pPr>
+      <w:r>
+        <w:t xml:space="preserve">  ubicación" del Hub) → </w:t>
+      </w:r>
+      <w:r>
+        <w:rPr>
+          <w:rFonts w:ascii="Consolas" w:cs="Consolas" w:eastAsia="Consolas" w:hAnsi="Consolas"/>
+          <w:sz w:val="19"/>
+          <w:szCs w:val="19"/>
+        </w:rPr>
+        <w:t xml:space="preserve">geolocation=(self)</w:t>
+      </w:r>
+      <w:r>
+        <w:t xml:space="preserve">.</w:t>
+      </w:r>
+    </w:p>
+    <w:p>
+      <w:pPr>
+        <w:spacing w:after="60"/>
+      </w:pPr>
+    </w:p>
+    <w:p>
+      <w:pPr>
+        <w:pStyle w:val="Heading3"/>
+        <w:spacing w:after="100" w:before="160"/>
+      </w:pPr>
+      <w:r>
+        <w:t xml:space="preserve">Lighthouse móvil (línea base, </w:t>
+      </w:r>
+      <w:r>
+        <w:rPr>
+          <w:rFonts w:ascii="Consolas" w:cs="Consolas" w:eastAsia="Consolas" w:hAnsi="Consolas"/>
+          <w:sz w:val="19"/>
+          <w:szCs w:val="19"/>
+        </w:rPr>
+        <w:t xml:space="preserve">auditorias/lighthouse-movil-20260906.*</w:t>
+      </w:r>
+      <w:r>
+        <w:t xml:space="preserve">)</w:t>
+      </w:r>
+    </w:p>
+    <w:p>
+      <w:pPr>
+        <w:spacing w:after="60"/>
+      </w:pPr>
+    </w:p>
+    <w:tbl>
+      <w:tblPr>
+        <w:tblW w:type="pct" w:w="100%"/>
+        <w:tblBorders>
+          <w:top w:val="single" w:color="auto" w:sz="4"/>
+          <w:left w:val="single" w:color="auto" w:sz="4"/>
+          <w:bottom w:val="single" w:color="auto" w:sz="4"/>
+          <w:right w:val="single" w:color="auto" w:sz="4"/>
+          <w:insideH w:val="single" w:color="auto" w:sz="4"/>
+          <w:insideV w:val="single" w:color="auto" w:sz="4"/>
+        </w:tblBorders>
+      </w:tblPr>
+      <w:tblGrid>
+        <w:gridCol w:w="100"/>
+        <w:gridCol w:w="100"/>
+      </w:tblGrid>
+      <w:tr>
+        <w:trPr>
+          <w:tblHeader/>
+        </w:trPr>
+        <w:tc>
+          <w:tcPr>
+            <w:tcBorders>
+              <w:top w:val="single" w:color="BBBBBB" w:sz="4"/>
+              <w:left w:val="single" w:color="BBBBBB" w:sz="4"/>
+              <w:bottom w:val="single" w:color="BBBBBB" w:sz="4"/>
+              <w:right w:val="single" w:color="BBBBBB" w:sz="4"/>
+            </w:tcBorders>
+            <w:shd w:fill="E8EEF4" w:val="clear"/>
+            <w:tcMar>
+              <w:top w:type="dxa" w:w="60"/>
+              <w:left w:type="dxa" w:w="90"/>
+              <w:bottom w:type="dxa" w:w="60"/>
+              <w:right w:type="dxa" w:w="90"/>
+            </w:tcMar>
+          </w:tcPr>
+          <w:p>
+            <w:r>
+              <w:rPr>
+                <w:b/>
+                <w:bCs/>
+              </w:rPr>
+            </w:r>
+          </w:p>
+        </w:tc>
+        <w:tc>
+          <w:tcPr>
+            <w:tcBorders>
+              <w:top w:val="single" w:color="BBBBBB" w:sz="4"/>
+              <w:left w:val="single" w:color="BBBBBB" w:sz="4"/>
+              <w:bottom w:val="single" w:color="BBBBBB" w:sz="4"/>
+              <w:right w:val="single" w:color="BBBBBB" w:sz="4"/>
+            </w:tcBorders>
+            <w:shd w:fill="E8EEF4" w:val="clear"/>
+            <w:tcMar>
+              <w:top w:type="dxa" w:w="60"/>
+              <w:left w:type="dxa" w:w="90"/>
+              <w:bottom w:type="dxa" w:w="60"/>
+              <w:right w:type="dxa" w:w="90"/>
+            </w:tcMar>
+          </w:tcPr>
+          <w:p>
+            <w:r>
+              <w:rPr>
+                <w:b/>
+                <w:bCs/>
+              </w:rPr>
+            </w:r>
+          </w:p>
+        </w:tc>
+      </w:tr>
+      <w:tr>
+        <w:trPr>
+          <w:tblHeader w:val="false"/>
+        </w:trPr>
+        <w:tc>
+          <w:tcPr>
+            <w:tcBorders>
+              <w:top w:val="single" w:color="BBBBBB" w:sz="4"/>
+              <w:left w:val="single" w:color="BBBBBB" w:sz="4"/>
+              <w:bottom w:val="single" w:color="BBBBBB" w:sz="4"/>
+              <w:right w:val="single" w:color="BBBBBB" w:sz="4"/>
+            </w:tcBorders>
+            <w:tcMar>
+              <w:top w:type="dxa" w:w="60"/>
+              <w:left w:type="dxa" w:w="90"/>
+              <w:bottom w:type="dxa" w:w="60"/>
+              <w:right w:type="dxa" w:w="90"/>
+            </w:tcMar>
+          </w:tcPr>
+          <w:p>
+            <w:r>
+              <w:t xml:space="preserve">Best Practices</w:t>
+            </w:r>
+          </w:p>
+        </w:tc>
+        <w:tc>
+          <w:tcPr>
+            <w:tcBorders>
+              <w:top w:val="single" w:color="BBBBBB" w:sz="4"/>
+              <w:left w:val="single" w:color="BBBBBB" w:sz="4"/>
+              <w:bottom w:val="single" w:color="BBBBBB" w:sz="4"/>
+              <w:right w:val="single" w:color="BBBBBB" w:sz="4"/>
+            </w:tcBorders>
+            <w:tcMar>
+              <w:top w:type="dxa" w:w="60"/>
+              <w:left w:type="dxa" w:w="90"/>
+              <w:bottom w:type="dxa" w:w="60"/>
+              <w:right w:type="dxa" w:w="90"/>
+            </w:tcMar>
+          </w:tcPr>
+          <w:p>
+            <w:r>
+              <w:rPr>
+                <w:b/>
+                <w:bCs/>
+              </w:rPr>
+              <w:t xml:space="preserve">100</w:t>
+            </w:r>
+          </w:p>
+        </w:tc>
+      </w:tr>
+      <w:tr>
+        <w:trPr>
+          <w:tblHeader w:val="false"/>
+        </w:trPr>
+        <w:tc>
+          <w:tcPr>
+            <w:tcBorders>
+              <w:top w:val="single" w:color="BBBBBB" w:sz="4"/>
+              <w:left w:val="single" w:color="BBBBBB" w:sz="4"/>
+              <w:bottom w:val="single" w:color="BBBBBB" w:sz="4"/>
+              <w:right w:val="single" w:color="BBBBBB" w:sz="4"/>
+            </w:tcBorders>
+            <w:tcMar>
+              <w:top w:type="dxa" w:w="60"/>
+              <w:left w:type="dxa" w:w="90"/>
+              <w:bottom w:type="dxa" w:w="60"/>
+              <w:right w:type="dxa" w:w="90"/>
+            </w:tcMar>
+          </w:tcPr>
+          <w:p>
+            <w:r>
+              <w:t xml:space="preserve">Performance</w:t>
+            </w:r>
+          </w:p>
+        </w:tc>
+        <w:tc>
+          <w:tcPr>
+            <w:tcBorders>
+              <w:top w:val="single" w:color="BBBBBB" w:sz="4"/>
+              <w:left w:val="single" w:color="BBBBBB" w:sz="4"/>
+              <w:bottom w:val="single" w:color="BBBBBB" w:sz="4"/>
+              <w:right w:val="single" w:color="BBBBBB" w:sz="4"/>
+            </w:tcBorders>
+            <w:tcMar>
+              <w:top w:type="dxa" w:w="60"/>
+              <w:left w:type="dxa" w:w="90"/>
+              <w:bottom w:type="dxa" w:w="60"/>
+              <w:right w:type="dxa" w:w="90"/>
+            </w:tcMar>
+          </w:tcPr>
+          <w:p>
+            <w:r>
+              <w:rPr>
+                <w:b/>
+                <w:bCs/>
+              </w:rPr>
+              <w:t xml:space="preserve">65</w:t>
+            </w:r>
+            <w:r>
+              <w:t xml:space="preserve"> (mejora por venir con la minificación de </w:t>
+            </w:r>
+            <w:r>
+              <w:rPr>
+                <w:rFonts w:ascii="Consolas" w:cs="Consolas" w:eastAsia="Consolas" w:hAnsi="Consolas"/>
+                <w:sz w:val="19"/>
+                <w:szCs w:val="19"/>
+              </w:rPr>
+              <w:t xml:space="preserve">app.js</w:t>
+            </w:r>
+            <w:r>
+              <w:t xml:space="preserve"> — Fase 2)</w:t>
+            </w:r>
+          </w:p>
+        </w:tc>
+      </w:tr>
+    </w:tbl>
+    <w:p>
+      <w:pPr>
+        <w:spacing w:after="120"/>
+      </w:pPr>
+    </w:p>
+    <w:p>
+      <w:pPr>
+        <w:spacing w:after="60"/>
+      </w:pPr>
+    </w:p>
+    <w:p>
+      <w:pPr>
+        <w:spacing w:after="120"/>
+      </w:pPr>
+      <w:r>
+        <w:t xml:space="preserve">Audits móviles clave: </w:t>
+      </w:r>
+      <w:r>
+        <w:rPr>
+          <w:rFonts w:ascii="Consolas" w:cs="Consolas" w:eastAsia="Consolas" w:hAnsi="Consolas"/>
+          <w:sz w:val="19"/>
+          <w:szCs w:val="19"/>
+        </w:rPr>
+        <w:t xml:space="preserve">viewport</w:t>
+      </w:r>
+      <w:r>
+        <w:t xml:space="preserve"> PASS · </w:t>
+      </w:r>
+      <w:r>
+        <w:rPr>
+          <w:rFonts w:ascii="Consolas" w:cs="Consolas" w:eastAsia="Consolas" w:hAnsi="Consolas"/>
+          <w:sz w:val="19"/>
+          <w:szCs w:val="19"/>
+        </w:rPr>
+        <w:t xml:space="preserve">font-size</w:t>
+      </w:r>
+      <w:r>
+        <w:t xml:space="preserve"> PASS (97 % legible, ayudó el cambio a 16px) · </w:t>
+      </w:r>
+      <w:r>
+        <w:rPr>
+          <w:rFonts w:ascii="Consolas" w:cs="Consolas" w:eastAsia="Consolas" w:hAnsi="Consolas"/>
+          <w:sz w:val="19"/>
+          <w:szCs w:val="19"/>
+        </w:rPr>
+        <w:t xml:space="preserve">uses-passive-event-listeners</w:t>
+      </w:r>
+      <w:r>
+        <w:t xml:space="preserve"> PASS · </w:t>
+      </w:r>
+      <w:r>
+        <w:rPr>
+          <w:rFonts w:ascii="Consolas" w:cs="Consolas" w:eastAsia="Consolas" w:hAnsi="Consolas"/>
+          <w:sz w:val="19"/>
+          <w:szCs w:val="19"/>
+        </w:rPr>
+        <w:t xml:space="preserve">errors-in-console</w:t>
+      </w:r>
+      <w:r>
+        <w:t xml:space="preserve"> PASS · </w:t>
+      </w:r>
+      <w:r>
+        <w:rPr>
+          <w:rFonts w:ascii="Consolas" w:cs="Consolas" w:eastAsia="Consolas" w:hAnsi="Consolas"/>
+          <w:sz w:val="19"/>
+          <w:szCs w:val="19"/>
+        </w:rPr>
+        <w:t xml:space="preserve">uses-text-compression</w:t>
+      </w:r>
+      <w:r>
+        <w:t xml:space="preserve"> PASS · </w:t>
+      </w:r>
+      <w:r>
+        <w:rPr>
+          <w:rFonts w:ascii="Consolas" w:cs="Consolas" w:eastAsia="Consolas" w:hAnsi="Consolas"/>
+          <w:sz w:val="19"/>
+          <w:szCs w:val="19"/>
+        </w:rPr>
+        <w:t xml:space="preserve">dom-size</w:t>
+      </w:r>
+      <w:r>
+        <w:t xml:space="preserve"> PASS (660) · </w:t>
+      </w:r>
+      <w:r>
+        <w:rPr>
+          <w:rFonts w:ascii="Consolas" w:cs="Consolas" w:eastAsia="Consolas" w:hAnsi="Consolas"/>
+          <w:sz w:val="19"/>
+          <w:szCs w:val="19"/>
+        </w:rPr>
+        <w:t xml:space="preserve">unminified-javascript</w:t>
+      </w:r>
+      <w:r>
+        <w:t xml:space="preserve"> </w:t>
+      </w:r>
+      <w:r>
+        <w:rPr>
+          <w:b/>
+          <w:bCs/>
+        </w:rPr>
+        <w:t xml:space="preserve">FAIL</w:t>
+      </w:r>
+      <w:r>
+        <w:t xml:space="preserve"> (~26 KiB — se resuelve minificando en Fase 2). Métricas: FCP 2.0 s · LCP 4.6 s · TBT 440 ms · CLS 0.149 · TTI 5.0 s. El hallazgo "Avoid multiple page redirects — 4.8 s" es un </w:t>
+      </w:r>
+      <w:r>
+        <w:rPr>
+          <w:b/>
+          <w:bCs/>
+        </w:rPr>
+        <w:t xml:space="preserve">artefacto del test</w:t>
+      </w:r>
+      <w:r>
+        <w:t xml:space="preserve"> (cuenta el 308 </w:t>
+      </w:r>
+      <w:r>
+        <w:rPr>
+          <w:rFonts w:ascii="Consolas" w:cs="Consolas" w:eastAsia="Consolas" w:hAnsi="Consolas"/>
+          <w:sz w:val="19"/>
+          <w:szCs w:val="19"/>
+        </w:rPr>
+        <w:t xml:space="preserve">http→https</w:t>
+      </w:r>
+      <w:r>
+        <w:t xml:space="preserve">; los usuarios reales entran por </w:t>
+      </w:r>
+      <w:r>
+        <w:rPr>
+          <w:rFonts w:ascii="Consolas" w:cs="Consolas" w:eastAsia="Consolas" w:hAnsi="Consolas"/>
+          <w:sz w:val="19"/>
+          <w:szCs w:val="19"/>
+        </w:rPr>
+        <w:t xml:space="preserve">https://</w:t>
+      </w:r>
+      <w:r>
+        <w:t xml:space="preserve"> y la PWA instalada usa </w:t>
+      </w:r>
+      <w:r>
+        <w:rPr>
+          <w:rFonts w:ascii="Consolas" w:cs="Consolas" w:eastAsia="Consolas" w:hAnsi="Consolas"/>
+          <w:sz w:val="19"/>
+          <w:szCs w:val="19"/>
+        </w:rPr>
+        <w:t xml:space="preserve">start_url</w:t>
+      </w:r>
+      <w:r>
+        <w:t xml:space="preserve"> directa → 0 redirects).</w:t>
+      </w:r>
+    </w:p>
+    <w:p>
+      <w:pPr>
+        <w:spacing w:after="60"/>
+      </w:pPr>
+    </w:p>
+    <w:p>
+      <w:pPr>
+        <w:pStyle w:val="Heading3"/>
+        <w:spacing w:after="100" w:before="160"/>
+      </w:pPr>
+      <w:r>
+        <w:t xml:space="preserve">Fase 0 — pendiente</w:t>
+      </w:r>
+    </w:p>
+    <w:p>
+      <w:pPr>
+        <w:pStyle w:val="ListParagraph"/>
+        <w:numPr>
+          <w:ilvl w:val="0"/>
+          <w:numId w:val="1"/>
+        </w:numPr>
+        <w:spacing w:after="40"/>
+      </w:pPr>
+      <w:r>
+        <w:rPr>
+          <w:b/>
+          <w:bCs/>
+        </w:rPr>
+        <w:t xml:space="preserve">0.2</w:t>
+      </w:r>
+      <w:r>
+        <w:t xml:space="preserve"> capturas reales del manifest (hoy hay placeholders de marca). Requiere el</w:t>
+      </w:r>
+    </w:p>
+    <w:p>
+      <w:pPr>
+        <w:spacing w:after="120"/>
+      </w:pPr>
+      <w:r>
+        <w:t xml:space="preserve">  navegador de captura, que en este entorno da error "0 width" — hacerlas a mano o   en CI.</w:t>
+      </w:r>
+    </w:p>
+    <w:p>
+      <w:pPr>
+        <w:pStyle w:val="ListParagraph"/>
+        <w:numPr>
+          <w:ilvl w:val="0"/>
+          <w:numId w:val="1"/>
+        </w:numPr>
+        <w:spacing w:after="40"/>
+      </w:pPr>
+      <w:r>
+        <w:rPr>
+          <w:b/>
+          <w:bCs/>
+        </w:rPr>
+        <w:t xml:space="preserve">0.6 minificación</w:t>
+      </w:r>
+      <w:r>
+        <w:t xml:space="preserve"> de </w:t>
+      </w:r>
+      <w:r>
+        <w:rPr>
+          <w:rFonts w:ascii="Consolas" w:cs="Consolas" w:eastAsia="Consolas" w:hAnsi="Consolas"/>
+          <w:sz w:val="19"/>
+          <w:szCs w:val="19"/>
+        </w:rPr>
+        <w:t xml:space="preserve">app.js</w:t>
+      </w:r>
+      <w:r>
+        <w:t xml:space="preserve">/</w:t>
+      </w:r>
+      <w:r>
+        <w:rPr>
+          <w:rFonts w:ascii="Consolas" w:cs="Consolas" w:eastAsia="Consolas" w:hAnsi="Consolas"/>
+          <w:sz w:val="19"/>
+          <w:szCs w:val="19"/>
+        </w:rPr>
+        <w:t xml:space="preserve">ui-fx.js</w:t>
+      </w:r>
+      <w:r>
+        <w:t xml:space="preserve"> + code-splitting → </w:t>
+      </w:r>
+      <w:r>
+        <w:rPr>
+          <w:b/>
+          <w:bCs/>
+        </w:rPr>
+        <w:t xml:space="preserve">Fase 2</w:t>
+      </w:r>
+      <w:r>
+        <w:t xml:space="preserve"> (esbuild</w:t>
+      </w:r>
+    </w:p>
+    <w:p>
+      <w:pPr>
+        <w:spacing w:after="120"/>
+      </w:pPr>
+      <w:r>
+        <w:t xml:space="preserve">  dentro de </w:t>
+      </w:r>
+      <w:r>
+        <w:rPr>
+          <w:rFonts w:ascii="Consolas" w:cs="Consolas" w:eastAsia="Consolas" w:hAnsi="Consolas"/>
+          <w:sz w:val="19"/>
+          <w:szCs w:val="19"/>
+        </w:rPr>
+        <w:t xml:space="preserve">scripts/build-www.mjs</w:t>
+      </w:r>
+      <w:r>
+        <w:t xml:space="preserve"> al montar Capacitor). Objetivo: Performance ≥ 80.</w:t>
+      </w:r>
+    </w:p>
+    <w:p>
+      <w:pPr>
+        <w:pStyle w:val="ListParagraph"/>
+        <w:numPr>
+          <w:ilvl w:val="0"/>
+          <w:numId w:val="1"/>
+        </w:numPr>
+        <w:spacing w:after="40"/>
+      </w:pPr>
+      <w:r>
+        <w:rPr>
+          <w:b/>
+          <w:bCs/>
+        </w:rPr>
+        <w:t xml:space="preserve">0.9</w:t>
+      </w:r>
+      <w:r>
+        <w:t xml:space="preserve"> re-correr Lighthouse tras la minificación y en un teléfono real de gama baja.</w:t>
+      </w:r>
+    </w:p>
+    <w:p>
+      <w:pPr>
+        <w:pStyle w:val="ListParagraph"/>
+        <w:numPr>
+          <w:ilvl w:val="0"/>
+          <w:numId w:val="1"/>
+        </w:numPr>
+        <w:spacing w:after="40"/>
+      </w:pPr>
+      <w:r>
+        <w:rPr>
+          <w:b/>
+          <w:bCs/>
+        </w:rPr>
+        <w:t xml:space="preserve">0.10</w:t>
+      </w:r>
+      <w:r>
+        <w:t xml:space="preserve"> </w:t>
+      </w:r>
+      <w:r>
+        <w:rPr>
+          <w:rFonts w:ascii="Consolas" w:cs="Consolas" w:eastAsia="Consolas" w:hAnsi="Consolas"/>
+          <w:sz w:val="19"/>
+          <w:szCs w:val="19"/>
+        </w:rPr>
+        <w:t xml:space="preserve">assetlinks.json</w:t>
+      </w:r>
+      <w:r>
+        <w:t xml:space="preserve"> — solo si al final se opta por TWA en vez de Capacitor.</w:t>
+      </w:r>
+    </w:p>
+    <w:p>
+      <w:pPr>
+        <w:spacing w:after="60"/>
+      </w:pPr>
+    </w:p>
+    <w:p>
+      <w:pPr>
+        <w:spacing w:after="120"/>
+      </w:pPr>
+      <w:r>
+        <w:t xml:space="preserve">Siguiente bloque recomendado: los </w:t>
+      </w:r>
+      <w:r>
+        <w:rPr>
+          <w:b/>
+          <w:bCs/>
+        </w:rPr>
+        <w:t xml:space="preserve">bloqueantes de tienda</w:t>
+      </w:r>
+      <w:r>
+        <w:t xml:space="preserve"> (login → Supabase Auth o gateway + rotar claves; política de privacidad + borrado de cuenta; sync sin conflictos), y luego </w:t>
+      </w:r>
+      <w:r>
+        <w:rPr>
+          <w:b/>
+          <w:bCs/>
+        </w:rPr>
+        <w:t xml:space="preserve">Fase 2 — Capacitor</w:t>
+      </w:r>
+      <w:r>
+        <w:t xml:space="preserve">.</w:t>
       </w:r>
     </w:p>
     <w:p>

</xml_diff>